<commit_message>
Compute all the results
</commit_message>
<xml_diff>
--- a/docs/Presentation_final.docx
+++ b/docs/Presentation_final.docx
@@ -19,6 +19,9 @@
       </w:r>
     </w:p>
     <w:p>
+      <w:pPr>
+        <w:jc w:val="center"/>
+      </w:pPr>
       <w:r>
         <w:rPr>
           <w:noProof/>
@@ -142,6 +145,9 @@
     </w:p>
     <w:p/>
     <w:p>
+      <w:pPr>
+        <w:jc w:val="center"/>
+      </w:pPr>
       <w:r>
         <w:rPr>
           <w:noProof/>
@@ -275,6 +281,9 @@
     </w:p>
     <w:p/>
     <w:p>
+      <w:pPr>
+        <w:jc w:val="center"/>
+      </w:pPr>
       <w:r>
         <w:rPr>
           <w:noProof/>
@@ -342,6 +351,9 @@
     </w:p>
     <w:p/>
     <w:p>
+      <w:pPr>
+        <w:jc w:val="center"/>
+      </w:pPr>
       <w:r>
         <w:rPr>
           <w:noProof/>
@@ -450,6 +462,9 @@
       </w:r>
     </w:p>
     <w:p>
+      <w:pPr>
+        <w:jc w:val="center"/>
+      </w:pPr>
       <w:r>
         <w:rPr>
           <w:noProof/>
@@ -522,6 +537,9 @@
       </w:r>
     </w:p>
     <w:p>
+      <w:pPr>
+        <w:jc w:val="center"/>
+      </w:pPr>
       <w:r>
         <w:rPr>
           <w:noProof/>
@@ -585,6 +603,9 @@
       </w:r>
     </w:p>
     <w:p>
+      <w:pPr>
+        <w:jc w:val="center"/>
+      </w:pPr>
       <w:r>
         <w:rPr>
           <w:noProof/>
@@ -640,6 +661,9 @@
       </w:r>
     </w:p>
     <w:p>
+      <w:pPr>
+        <w:jc w:val="center"/>
+      </w:pPr>
       <w:r>
         <w:rPr>
           <w:noProof/>
@@ -700,39 +724,16 @@
     </w:p>
     <w:p>
       <w:pPr>
-        <w:rPr>
-          <w:color w:val="EE0000"/>
-        </w:rPr>
-      </w:pPr>
-      <w:r>
-        <w:rPr>
-          <w:color w:val="EE0000"/>
-        </w:rPr>
-        <w:t>Argon</w:t>
-      </w:r>
-    </w:p>
-    <w:p>
-      <w:pPr>
-        <w:rPr>
-          <w:color w:val="0070C0"/>
-        </w:rPr>
-      </w:pPr>
-      <w:r>
-        <w:rPr>
-          <w:color w:val="0070C0"/>
-        </w:rPr>
-        <w:t>Hélium</w:t>
-      </w:r>
-    </w:p>
-    <w:p>
+        <w:jc w:val="center"/>
+      </w:pPr>
       <w:r>
         <w:rPr>
           <w:noProof/>
         </w:rPr>
         <w:drawing>
-          <wp:inline distT="0" distB="0" distL="0" distR="0" wp14:anchorId="47FE11CE" wp14:editId="36DFC858">
-            <wp:extent cx="3448050" cy="1883657"/>
-            <wp:effectExtent l="0" t="0" r="0" b="2540"/>
+          <wp:inline distT="0" distB="0" distL="0" distR="0" wp14:anchorId="47FE11CE" wp14:editId="61F3C296">
+            <wp:extent cx="4480560" cy="2447713"/>
+            <wp:effectExtent l="0" t="0" r="0" b="0"/>
             <wp:docPr id="2115403778" name="Image 1"/>
             <wp:cNvGraphicFramePr>
               <a:graphicFrameLocks xmlns:a="http://schemas.openxmlformats.org/drawingml/2006/main" noChangeAspect="1"/>
@@ -753,7 +754,7 @@
                   <pic:spPr>
                     <a:xfrm>
                       <a:off x="0" y="0"/>
-                      <a:ext cx="3453550" cy="1886661"/>
+                      <a:ext cx="4489738" cy="2452727"/>
                     </a:xfrm>
                     <a:prstGeom prst="rect">
                       <a:avLst/>
@@ -767,15 +768,18 @@
       </w:r>
     </w:p>
     <w:p>
+      <w:pPr>
+        <w:jc w:val="center"/>
+      </w:pPr>
       <w:r>
         <w:rPr>
           <w:noProof/>
         </w:rPr>
         <w:drawing>
-          <wp:inline distT="0" distB="0" distL="0" distR="0" wp14:anchorId="266E6DD2" wp14:editId="0F8F9CC7">
-            <wp:extent cx="6299835" cy="1198880"/>
-            <wp:effectExtent l="0" t="0" r="5715" b="1270"/>
-            <wp:docPr id="2100019135" name="Image 1"/>
+          <wp:inline distT="0" distB="0" distL="0" distR="0" wp14:anchorId="7DF192F8" wp14:editId="50BA57C8">
+            <wp:extent cx="4002056" cy="2667000"/>
+            <wp:effectExtent l="0" t="0" r="0" b="0"/>
+            <wp:docPr id="1395842301" name="Image 1"/>
             <wp:cNvGraphicFramePr>
               <a:graphicFrameLocks xmlns:a="http://schemas.openxmlformats.org/drawingml/2006/main" noChangeAspect="1"/>
             </wp:cNvGraphicFramePr>
@@ -783,23 +787,36 @@
               <a:graphicData uri="http://schemas.openxmlformats.org/drawingml/2006/picture">
                 <pic:pic xmlns:pic="http://schemas.openxmlformats.org/drawingml/2006/picture">
                   <pic:nvPicPr>
-                    <pic:cNvPr id="2100019135" name=""/>
-                    <pic:cNvPicPr/>
+                    <pic:cNvPr id="0" name="Picture 1"/>
+                    <pic:cNvPicPr>
+                      <a:picLocks noChangeAspect="1" noChangeArrowheads="1"/>
+                    </pic:cNvPicPr>
                   </pic:nvPicPr>
                   <pic:blipFill>
-                    <a:blip r:embed="rId20"/>
+                    <a:blip r:embed="rId20">
+                      <a:extLst>
+                        <a:ext uri="{28A0092B-C50C-407E-A947-70E740481C1C}">
+                          <a14:useLocalDpi xmlns:a14="http://schemas.microsoft.com/office/drawing/2010/main" val="0"/>
+                        </a:ext>
+                      </a:extLst>
+                    </a:blip>
+                    <a:srcRect/>
                     <a:stretch>
                       <a:fillRect/>
                     </a:stretch>
                   </pic:blipFill>
-                  <pic:spPr>
+                  <pic:spPr bwMode="auto">
                     <a:xfrm>
                       <a:off x="0" y="0"/>
-                      <a:ext cx="6299835" cy="1198880"/>
+                      <a:ext cx="4027593" cy="2684018"/>
                     </a:xfrm>
                     <a:prstGeom prst="rect">
                       <a:avLst/>
                     </a:prstGeom>
+                    <a:noFill/>
+                    <a:ln>
+                      <a:noFill/>
+                    </a:ln>
                   </pic:spPr>
                 </pic:pic>
               </a:graphicData>
@@ -817,6 +834,9 @@
       </w:r>
     </w:p>
     <w:p>
+      <w:pPr>
+        <w:jc w:val="center"/>
+      </w:pPr>
       <w:r>
         <w:rPr>
           <w:noProof/>
@@ -873,29 +893,266 @@
     </w:p>
     <w:p>
       <w:pPr>
+        <w:pStyle w:val="Titre1"/>
+      </w:pPr>
+      <w:r>
+        <w:lastRenderedPageBreak/>
+        <w:t>Entropie</w:t>
+      </w:r>
+    </w:p>
+    <w:p/>
+    <w:p>
+      <w:pPr>
+        <w:jc w:val="center"/>
+      </w:pPr>
+      <w:r>
+        <w:rPr>
+          <w:noProof/>
+        </w:rPr>
+        <w:drawing>
+          <wp:inline distT="0" distB="0" distL="0" distR="0" wp14:anchorId="7DA3ECC1" wp14:editId="1512B706">
+            <wp:extent cx="5231081" cy="3487194"/>
+            <wp:effectExtent l="0" t="0" r="8255" b="0"/>
+            <wp:docPr id="375738890" name="Image 2"/>
+            <wp:cNvGraphicFramePr>
+              <a:graphicFrameLocks xmlns:a="http://schemas.openxmlformats.org/drawingml/2006/main" noChangeAspect="1"/>
+            </wp:cNvGraphicFramePr>
+            <a:graphic xmlns:a="http://schemas.openxmlformats.org/drawingml/2006/main">
+              <a:graphicData uri="http://schemas.openxmlformats.org/drawingml/2006/picture">
+                <pic:pic xmlns:pic="http://schemas.openxmlformats.org/drawingml/2006/picture">
+                  <pic:nvPicPr>
+                    <pic:cNvPr id="0" name="Picture 6"/>
+                    <pic:cNvPicPr>
+                      <a:picLocks noChangeAspect="1" noChangeArrowheads="1"/>
+                    </pic:cNvPicPr>
+                  </pic:nvPicPr>
+                  <pic:blipFill>
+                    <a:blip r:embed="rId22">
+                      <a:extLst>
+                        <a:ext uri="{28A0092B-C50C-407E-A947-70E740481C1C}">
+                          <a14:useLocalDpi xmlns:a14="http://schemas.microsoft.com/office/drawing/2010/main" val="0"/>
+                        </a:ext>
+                      </a:extLst>
+                    </a:blip>
+                    <a:srcRect/>
+                    <a:stretch>
+                      <a:fillRect/>
+                    </a:stretch>
+                  </pic:blipFill>
+                  <pic:spPr bwMode="auto">
+                    <a:xfrm>
+                      <a:off x="0" y="0"/>
+                      <a:ext cx="5240455" cy="3493443"/>
+                    </a:xfrm>
+                    <a:prstGeom prst="rect">
+                      <a:avLst/>
+                    </a:prstGeom>
+                    <a:noFill/>
+                    <a:ln>
+                      <a:noFill/>
+                    </a:ln>
+                  </pic:spPr>
+                </pic:pic>
+              </a:graphicData>
+            </a:graphic>
+          </wp:inline>
+        </w:drawing>
+      </w:r>
+    </w:p>
+    <w:p>
+      <w:pPr>
+        <w:jc w:val="center"/>
+      </w:pPr>
+      <w:r>
+        <w:rPr>
+          <w:noProof/>
+        </w:rPr>
+        <w:drawing>
+          <wp:inline distT="0" distB="0" distL="0" distR="0" wp14:anchorId="0650A692" wp14:editId="76D9462F">
+            <wp:extent cx="5406542" cy="3604161"/>
+            <wp:effectExtent l="0" t="0" r="3810" b="0"/>
+            <wp:docPr id="9874810" name="Image 3"/>
+            <wp:cNvGraphicFramePr>
+              <a:graphicFrameLocks xmlns:a="http://schemas.openxmlformats.org/drawingml/2006/main" noChangeAspect="1"/>
+            </wp:cNvGraphicFramePr>
+            <a:graphic xmlns:a="http://schemas.openxmlformats.org/drawingml/2006/main">
+              <a:graphicData uri="http://schemas.openxmlformats.org/drawingml/2006/picture">
+                <pic:pic xmlns:pic="http://schemas.openxmlformats.org/drawingml/2006/picture">
+                  <pic:nvPicPr>
+                    <pic:cNvPr id="0" name="Picture 8"/>
+                    <pic:cNvPicPr>
+                      <a:picLocks noChangeAspect="1" noChangeArrowheads="1"/>
+                    </pic:cNvPicPr>
+                  </pic:nvPicPr>
+                  <pic:blipFill>
+                    <a:blip r:embed="rId23">
+                      <a:extLst>
+                        <a:ext uri="{28A0092B-C50C-407E-A947-70E740481C1C}">
+                          <a14:useLocalDpi xmlns:a14="http://schemas.microsoft.com/office/drawing/2010/main" val="0"/>
+                        </a:ext>
+                      </a:extLst>
+                    </a:blip>
+                    <a:srcRect/>
+                    <a:stretch>
+                      <a:fillRect/>
+                    </a:stretch>
+                  </pic:blipFill>
+                  <pic:spPr bwMode="auto">
+                    <a:xfrm>
+                      <a:off x="0" y="0"/>
+                      <a:ext cx="5435454" cy="3623435"/>
+                    </a:xfrm>
+                    <a:prstGeom prst="rect">
+                      <a:avLst/>
+                    </a:prstGeom>
+                    <a:noFill/>
+                    <a:ln>
+                      <a:noFill/>
+                    </a:ln>
+                  </pic:spPr>
+                </pic:pic>
+              </a:graphicData>
+            </a:graphic>
+          </wp:inline>
+        </w:drawing>
+      </w:r>
+    </w:p>
+    <w:p>
+      <w:pPr>
         <w:spacing w:after="200" w:line="276" w:lineRule="auto"/>
       </w:pPr>
       <w:r>
         <w:br w:type="page"/>
       </w:r>
     </w:p>
-    <w:p/>
     <w:p>
       <w:pPr>
         <w:pStyle w:val="Titre1"/>
       </w:pPr>
       <w:r>
-        <w:t>Entropie</w:t>
-      </w:r>
-    </w:p>
-    <w:p/>
-    <w:p/>
-    <w:p>
-      <w:pPr>
-        <w:spacing w:after="200" w:line="276" w:lineRule="auto"/>
-      </w:pPr>
-      <w:r>
-        <w:br w:type="page"/>
+        <w:lastRenderedPageBreak/>
+        <w:t>Gradient de température</w:t>
+      </w:r>
+    </w:p>
+    <w:p>
+      <w:pPr>
+        <w:jc w:val="center"/>
+      </w:pPr>
+      <w:r>
+        <w:rPr>
+          <w:noProof/>
+        </w:rPr>
+        <w:drawing>
+          <wp:inline distT="0" distB="0" distL="0" distR="0" wp14:anchorId="1F599B09" wp14:editId="6D5F0E9B">
+            <wp:extent cx="6003309" cy="4001984"/>
+            <wp:effectExtent l="0" t="0" r="0" b="0"/>
+            <wp:docPr id="1979005304" name="Image 4"/>
+            <wp:cNvGraphicFramePr>
+              <a:graphicFrameLocks xmlns:a="http://schemas.openxmlformats.org/drawingml/2006/main" noChangeAspect="1"/>
+            </wp:cNvGraphicFramePr>
+            <a:graphic xmlns:a="http://schemas.openxmlformats.org/drawingml/2006/main">
+              <a:graphicData uri="http://schemas.openxmlformats.org/drawingml/2006/picture">
+                <pic:pic xmlns:pic="http://schemas.openxmlformats.org/drawingml/2006/picture">
+                  <pic:nvPicPr>
+                    <pic:cNvPr id="0" name="Picture 10"/>
+                    <pic:cNvPicPr>
+                      <a:picLocks noChangeAspect="1" noChangeArrowheads="1"/>
+                    </pic:cNvPicPr>
+                  </pic:nvPicPr>
+                  <pic:blipFill>
+                    <a:blip r:embed="rId24">
+                      <a:extLst>
+                        <a:ext uri="{28A0092B-C50C-407E-A947-70E740481C1C}">
+                          <a14:useLocalDpi xmlns:a14="http://schemas.microsoft.com/office/drawing/2010/main" val="0"/>
+                        </a:ext>
+                      </a:extLst>
+                    </a:blip>
+                    <a:srcRect/>
+                    <a:stretch>
+                      <a:fillRect/>
+                    </a:stretch>
+                  </pic:blipFill>
+                  <pic:spPr bwMode="auto">
+                    <a:xfrm>
+                      <a:off x="0" y="0"/>
+                      <a:ext cx="6020667" cy="4013556"/>
+                    </a:xfrm>
+                    <a:prstGeom prst="rect">
+                      <a:avLst/>
+                    </a:prstGeom>
+                    <a:noFill/>
+                    <a:ln>
+                      <a:noFill/>
+                    </a:ln>
+                  </pic:spPr>
+                </pic:pic>
+              </a:graphicData>
+            </a:graphic>
+          </wp:inline>
+        </w:drawing>
+      </w:r>
+    </w:p>
+    <w:p>
+      <w:pPr>
+        <w:jc w:val="center"/>
+      </w:pPr>
+    </w:p>
+    <w:p>
+      <w:pPr>
+        <w:jc w:val="center"/>
+      </w:pPr>
+      <w:r>
+        <w:rPr>
+          <w:noProof/>
+        </w:rPr>
+        <w:drawing>
+          <wp:inline distT="0" distB="0" distL="0" distR="0" wp14:anchorId="1633F0F6" wp14:editId="6C9881AE">
+            <wp:extent cx="5718175" cy="3811905"/>
+            <wp:effectExtent l="0" t="0" r="0" b="0"/>
+            <wp:docPr id="2099597287" name="Image 5"/>
+            <wp:cNvGraphicFramePr>
+              <a:graphicFrameLocks xmlns:a="http://schemas.openxmlformats.org/drawingml/2006/main" noChangeAspect="1"/>
+            </wp:cNvGraphicFramePr>
+            <a:graphic xmlns:a="http://schemas.openxmlformats.org/drawingml/2006/main">
+              <a:graphicData uri="http://schemas.openxmlformats.org/drawingml/2006/picture">
+                <pic:pic xmlns:pic="http://schemas.openxmlformats.org/drawingml/2006/picture">
+                  <pic:nvPicPr>
+                    <pic:cNvPr id="0" name="Picture 12"/>
+                    <pic:cNvPicPr>
+                      <a:picLocks noChangeAspect="1" noChangeArrowheads="1"/>
+                    </pic:cNvPicPr>
+                  </pic:nvPicPr>
+                  <pic:blipFill>
+                    <a:blip r:embed="rId25">
+                      <a:extLst>
+                        <a:ext uri="{28A0092B-C50C-407E-A947-70E740481C1C}">
+                          <a14:useLocalDpi xmlns:a14="http://schemas.microsoft.com/office/drawing/2010/main" val="0"/>
+                        </a:ext>
+                      </a:extLst>
+                    </a:blip>
+                    <a:srcRect/>
+                    <a:stretch>
+                      <a:fillRect/>
+                    </a:stretch>
+                  </pic:blipFill>
+                  <pic:spPr bwMode="auto">
+                    <a:xfrm>
+                      <a:off x="0" y="0"/>
+                      <a:ext cx="5718175" cy="3811905"/>
+                    </a:xfrm>
+                    <a:prstGeom prst="rect">
+                      <a:avLst/>
+                    </a:prstGeom>
+                    <a:noFill/>
+                    <a:ln>
+                      <a:noFill/>
+                    </a:ln>
+                  </pic:spPr>
+                </pic:pic>
+              </a:graphicData>
+            </a:graphic>
+          </wp:inline>
+        </w:drawing>
       </w:r>
     </w:p>
     <w:p>
@@ -913,6 +1170,9 @@
         <w:jc w:val="center"/>
       </w:pPr>
       <w:r>
+        <w:rPr>
+          <w:noProof/>
+        </w:rPr>
         <w:drawing>
           <wp:inline distT="0" distB="0" distL="0" distR="0" wp14:anchorId="5BF44F09" wp14:editId="22B55DD2">
             <wp:extent cx="3903260" cy="3906486"/>
@@ -929,7 +1189,7 @@
                     <pic:cNvPicPr/>
                   </pic:nvPicPr>
                   <pic:blipFill>
-                    <a:blip r:embed="rId22"/>
+                    <a:blip r:embed="rId26"/>
                     <a:stretch>
                       <a:fillRect/>
                     </a:stretch>
@@ -955,6 +1215,9 @@
         <w:jc w:val="center"/>
       </w:pPr>
       <w:r>
+        <w:rPr>
+          <w:noProof/>
+        </w:rPr>
         <w:drawing>
           <wp:inline distT="0" distB="0" distL="0" distR="0" wp14:anchorId="20FB4589" wp14:editId="11164188">
             <wp:extent cx="3869140" cy="3872336"/>
@@ -971,7 +1234,7 @@
                     <pic:cNvPicPr/>
                   </pic:nvPicPr>
                   <pic:blipFill>
-                    <a:blip r:embed="rId23"/>
+                    <a:blip r:embed="rId27"/>
                     <a:stretch>
                       <a:fillRect/>
                     </a:stretch>
@@ -1027,7 +1290,7 @@
                     </pic:cNvPicPr>
                   </pic:nvPicPr>
                   <pic:blipFill>
-                    <a:blip r:embed="rId24">
+                    <a:blip r:embed="rId28">
                       <a:extLst>
                         <a:ext uri="{28A0092B-C50C-407E-A947-70E740481C1C}">
                           <a14:useLocalDpi xmlns:a14="http://schemas.microsoft.com/office/drawing/2010/main" val="0"/>
@@ -1085,7 +1348,7 @@
                     </pic:cNvPicPr>
                   </pic:nvPicPr>
                   <pic:blipFill>
-                    <a:blip r:embed="rId25">
+                    <a:blip r:embed="rId29">
                       <a:extLst>
                         <a:ext uri="{28A0092B-C50C-407E-A947-70E740481C1C}">
                           <a14:useLocalDpi xmlns:a14="http://schemas.microsoft.com/office/drawing/2010/main" val="0"/>
@@ -1143,7 +1406,7 @@
                     </pic:cNvPicPr>
                   </pic:nvPicPr>
                   <pic:blipFill>
-                    <a:blip r:embed="rId26">
+                    <a:blip r:embed="rId30">
                       <a:extLst>
                         <a:ext uri="{28A0092B-C50C-407E-A947-70E740481C1C}">
                           <a14:useLocalDpi xmlns:a14="http://schemas.microsoft.com/office/drawing/2010/main" val="0"/>
@@ -1176,8 +1439,8 @@
       </w:r>
     </w:p>
     <w:sectPr>
-      <w:headerReference w:type="default" r:id="rId27"/>
-      <w:footerReference w:type="default" r:id="rId28"/>
+      <w:headerReference w:type="default" r:id="rId31"/>
+      <w:footerReference w:type="default" r:id="rId32"/>
       <w:pgSz w:w="11906" w:h="16838" w:code="9"/>
       <w:pgMar w:top="1985" w:right="851" w:bottom="1588" w:left="1134" w:header="851" w:footer="680" w:gutter="0"/>
       <w:cols w:space="708"/>

</xml_diff>